<commit_message>
Code to compare fitting all gaussian curves in one model vs. separate models by location. Also adding code for absolute change in yield with flowering day
</commit_message>
<xml_diff>
--- a/scripts/Script_Descriptions.docx
+++ b/scripts/Script_Descriptions.docx
@@ -158,8 +158,13 @@
           </w:tcPr>
           <w:p>
             <w:r>
-              <w:t>00_analysis_functions.R</w:t>
-            </w:r>
+              <w:t>00_analysis_</w:t>
+            </w:r>
+            <w:proofErr w:type="gramStart"/>
+            <w:r>
+              <w:t>functions.R</w:t>
+            </w:r>
+            <w:proofErr w:type="gramEnd"/>
           </w:p>
         </w:tc>
         <w:tc>
@@ -168,8 +173,13 @@
           </w:tcPr>
           <w:p>
             <w:r>
-              <w:t>00_analysis_functions.R</w:t>
-            </w:r>
+              <w:t>00_analysis_</w:t>
+            </w:r>
+            <w:proofErr w:type="gramStart"/>
+            <w:r>
+              <w:t>functions.R</w:t>
+            </w:r>
+            <w:proofErr w:type="gramEnd"/>
           </w:p>
         </w:tc>
         <w:tc>
@@ -208,8 +218,13 @@
               <w:t>1</w:t>
             </w:r>
             <w:r>
-              <w:t>_R2_analyses.R</w:t>
-            </w:r>
+              <w:t>_R2_</w:t>
+            </w:r>
+            <w:proofErr w:type="gramStart"/>
+            <w:r>
+              <w:t>analyses.R</w:t>
+            </w:r>
+            <w:proofErr w:type="gramEnd"/>
           </w:p>
         </w:tc>
         <w:tc>
@@ -218,8 +233,13 @@
           </w:tcPr>
           <w:p>
             <w:r>
-              <w:t>R2_analyses.R</w:t>
-            </w:r>
+              <w:t>R2_</w:t>
+            </w:r>
+            <w:proofErr w:type="gramStart"/>
+            <w:r>
+              <w:t>analyses.R</w:t>
+            </w:r>
+            <w:proofErr w:type="gramEnd"/>
           </w:p>
         </w:tc>
         <w:tc>
@@ -246,8 +266,13 @@
               <w:ind w:left="108" w:right="-42" w:hanging="153"/>
             </w:pPr>
             <w:r>
-              <w:t>00_analysis_functions.R</w:t>
-            </w:r>
+              <w:t>00_analysis_</w:t>
+            </w:r>
+            <w:proofErr w:type="gramStart"/>
+            <w:r>
+              <w:t>functions.R</w:t>
+            </w:r>
+            <w:proofErr w:type="gramEnd"/>
           </w:p>
           <w:p>
             <w:pPr>
@@ -415,8 +440,13 @@
               <w:t>2</w:t>
             </w:r>
             <w:r>
-              <w:t>_gaus_opt_flow_time.R</w:t>
-            </w:r>
+              <w:t>_gaus_opt_flow_</w:t>
+            </w:r>
+            <w:proofErr w:type="gramStart"/>
+            <w:r>
+              <w:t>time.R</w:t>
+            </w:r>
+            <w:proofErr w:type="gramEnd"/>
           </w:p>
         </w:tc>
         <w:tc>
@@ -425,8 +455,13 @@
           </w:tcPr>
           <w:p>
             <w:r>
-              <w:t>04_gaus_opt_flow_time.R</w:t>
-            </w:r>
+              <w:t>04_gaus_opt_flow_</w:t>
+            </w:r>
+            <w:proofErr w:type="gramStart"/>
+            <w:r>
+              <w:t>time.R</w:t>
+            </w:r>
+            <w:proofErr w:type="gramEnd"/>
           </w:p>
         </w:tc>
         <w:tc>
@@ -444,12 +479,6 @@
               <w:t>Also runs analysis on absolute performance of trials.</w:t>
             </w:r>
           </w:p>
-          <w:p/>
-          <w:p>
-            <w:r>
-              <w:t xml:space="preserve"> Must run first half of 02_R2_analysis.R prior to running the functions in this script</w:t>
-            </w:r>
-          </w:p>
         </w:tc>
         <w:tc>
           <w:tcPr>
@@ -465,8 +494,13 @@
               <w:ind w:left="108" w:right="-42" w:hanging="153"/>
             </w:pPr>
             <w:r>
-              <w:t>00_analysis_functions.R</w:t>
-            </w:r>
+              <w:t>00_analysis_</w:t>
+            </w:r>
+            <w:proofErr w:type="gramStart"/>
+            <w:r>
+              <w:t>functions.R</w:t>
+            </w:r>
+            <w:proofErr w:type="gramEnd"/>
           </w:p>
           <w:p>
             <w:pPr>
@@ -552,9 +586,16 @@
               </w:numPr>
               <w:ind w:left="108" w:right="-42" w:hanging="153"/>
             </w:pPr>
-            <w:r>
-              <w:t>gauss_allexact_mods.RData</w:t>
-            </w:r>
+            <w:proofErr w:type="spellStart"/>
+            <w:r>
+              <w:t>gauss_allexact_</w:t>
+            </w:r>
+            <w:proofErr w:type="gramStart"/>
+            <w:r>
+              <w:t>mods.RData</w:t>
+            </w:r>
+            <w:proofErr w:type="spellEnd"/>
+            <w:proofErr w:type="gramEnd"/>
           </w:p>
           <w:p>
             <w:pPr>
@@ -610,9 +651,16 @@
               </w:numPr>
               <w:ind w:left="108" w:right="-42" w:hanging="153"/>
             </w:pPr>
-            <w:r>
-              <w:t>gauss_county_mods.RData</w:t>
-            </w:r>
+            <w:proofErr w:type="spellStart"/>
+            <w:r>
+              <w:t>gauss_county_</w:t>
+            </w:r>
+            <w:proofErr w:type="gramStart"/>
+            <w:r>
+              <w:t>mods.RData</w:t>
+            </w:r>
+            <w:proofErr w:type="spellEnd"/>
+            <w:proofErr w:type="gramEnd"/>
           </w:p>
           <w:p>
             <w:pPr>
@@ -732,8 +780,13 @@
           <w:p>
             <w:r>
               <w:lastRenderedPageBreak/>
-              <w:t>03_clim_yearly_stats.R</w:t>
-            </w:r>
+              <w:t>03_clim_yearly_</w:t>
+            </w:r>
+            <w:proofErr w:type="gramStart"/>
+            <w:r>
+              <w:t>stats.R</w:t>
+            </w:r>
+            <w:proofErr w:type="gramEnd"/>
           </w:p>
         </w:tc>
         <w:tc>
@@ -742,8 +795,13 @@
           </w:tcPr>
           <w:p>
             <w:r>
-              <w:t>06_clim_analyses.R</w:t>
-            </w:r>
+              <w:t>06_clim_</w:t>
+            </w:r>
+            <w:proofErr w:type="gramStart"/>
+            <w:r>
+              <w:t>analyses.R</w:t>
+            </w:r>
+            <w:proofErr w:type="gramEnd"/>
           </w:p>
         </w:tc>
         <w:tc>
@@ -752,7 +810,15 @@
           </w:tcPr>
           <w:p>
             <w:r>
-              <w:t xml:space="preserve">Creates a yearly summary of climate parameters for each location from the Daymet data from 1980-2023. </w:t>
+              <w:t xml:space="preserve">Creates a yearly summary of climate parameters for each location from the </w:t>
+            </w:r>
+            <w:proofErr w:type="spellStart"/>
+            <w:r>
+              <w:t>Daymet</w:t>
+            </w:r>
+            <w:proofErr w:type="spellEnd"/>
+            <w:r>
+              <w:t xml:space="preserve"> data from 1980-2023. </w:t>
             </w:r>
           </w:p>
           <w:p/>
@@ -864,8 +930,13 @@
           </w:tcPr>
           <w:p>
             <w:r>
-              <w:t>04_clim_analyses_optimum.R</w:t>
-            </w:r>
+              <w:t>04_clim_analyses_</w:t>
+            </w:r>
+            <w:proofErr w:type="gramStart"/>
+            <w:r>
+              <w:t>optimum.R</w:t>
+            </w:r>
+            <w:proofErr w:type="gramEnd"/>
           </w:p>
         </w:tc>
         <w:tc>
@@ -874,8 +945,13 @@
           </w:tcPr>
           <w:p>
             <w:r>
-              <w:t>06a_clim_analyses_optimum.R</w:t>
-            </w:r>
+              <w:t>06a_clim_analyses_</w:t>
+            </w:r>
+            <w:proofErr w:type="gramStart"/>
+            <w:r>
+              <w:t>optimum.R</w:t>
+            </w:r>
+            <w:proofErr w:type="gramEnd"/>
           </w:p>
         </w:tc>
         <w:tc>
@@ -1205,8 +1281,13 @@
           </w:tcPr>
           <w:p>
             <w:r>
-              <w:t>05_proportion_optimal.R</w:t>
-            </w:r>
+              <w:t>05_proportion_</w:t>
+            </w:r>
+            <w:proofErr w:type="gramStart"/>
+            <w:r>
+              <w:t>optimal.R</w:t>
+            </w:r>
+            <w:proofErr w:type="gramEnd"/>
           </w:p>
         </w:tc>
         <w:tc>
@@ -1215,8 +1296,13 @@
           </w:tcPr>
           <w:p>
             <w:r>
-              <w:t>07_proportion_optimal.R</w:t>
-            </w:r>
+              <w:t>07_proportion_</w:t>
+            </w:r>
+            <w:proofErr w:type="gramStart"/>
+            <w:r>
+              <w:t>optimal.R</w:t>
+            </w:r>
+            <w:proofErr w:type="gramEnd"/>
           </w:p>
         </w:tc>
         <w:tc>
@@ -1318,9 +1404,11 @@
             <w:tcW w:w="781" w:type="pct"/>
           </w:tcPr>
           <w:p>
+            <w:proofErr w:type="spellStart"/>
             <w:r>
               <w:t>variation_DPP.R</w:t>
             </w:r>
+            <w:proofErr w:type="spellEnd"/>
           </w:p>
         </w:tc>
         <w:tc>
@@ -1416,8 +1504,13 @@
           </w:tcPr>
           <w:p>
             <w:r>
-              <w:t>07_ugly_map.R</w:t>
-            </w:r>
+              <w:t>07_ugly_</w:t>
+            </w:r>
+            <w:proofErr w:type="gramStart"/>
+            <w:r>
+              <w:t>map.R</w:t>
+            </w:r>
+            <w:proofErr w:type="gramEnd"/>
           </w:p>
         </w:tc>
         <w:tc>
@@ -1425,9 +1518,16 @@
             <w:tcW w:w="781" w:type="pct"/>
           </w:tcPr>
           <w:p>
-            <w:r>
-              <w:t>ugly_map.R</w:t>
-            </w:r>
+            <w:proofErr w:type="spellStart"/>
+            <w:r>
+              <w:t>ugly_</w:t>
+            </w:r>
+            <w:proofErr w:type="gramStart"/>
+            <w:r>
+              <w:t>map.R</w:t>
+            </w:r>
+            <w:proofErr w:type="spellEnd"/>
+            <w:proofErr w:type="gramEnd"/>
           </w:p>
         </w:tc>
         <w:tc>
@@ -1512,8 +1612,13 @@
           </w:tcPr>
           <w:p>
             <w:r>
-              <w:t>08_summary_stats.R</w:t>
-            </w:r>
+              <w:t>08_summary_</w:t>
+            </w:r>
+            <w:proofErr w:type="gramStart"/>
+            <w:r>
+              <w:t>stats.R</w:t>
+            </w:r>
+            <w:proofErr w:type="gramEnd"/>
           </w:p>
         </w:tc>
         <w:tc>
@@ -1521,9 +1626,16 @@
             <w:tcW w:w="781" w:type="pct"/>
           </w:tcPr>
           <w:p>
-            <w:r>
-              <w:t>summary_stats.R</w:t>
-            </w:r>
+            <w:proofErr w:type="spellStart"/>
+            <w:r>
+              <w:t>summary_</w:t>
+            </w:r>
+            <w:proofErr w:type="gramStart"/>
+            <w:r>
+              <w:t>stats.R</w:t>
+            </w:r>
+            <w:proofErr w:type="spellEnd"/>
+            <w:proofErr w:type="gramEnd"/>
           </w:p>
         </w:tc>
         <w:tc>
@@ -1582,8 +1694,13 @@
           </w:tcPr>
           <w:p>
             <w:r>
-              <w:t>09_climate_trends.R</w:t>
-            </w:r>
+              <w:t>09_climate_</w:t>
+            </w:r>
+            <w:proofErr w:type="gramStart"/>
+            <w:r>
+              <w:t>trends.R</w:t>
+            </w:r>
+            <w:proofErr w:type="gramEnd"/>
           </w:p>
         </w:tc>
         <w:tc>
@@ -1591,9 +1708,16 @@
             <w:tcW w:w="781" w:type="pct"/>
           </w:tcPr>
           <w:p>
-            <w:r>
-              <w:t>climate_trends.R</w:t>
-            </w:r>
+            <w:proofErr w:type="spellStart"/>
+            <w:r>
+              <w:t>climate_</w:t>
+            </w:r>
+            <w:proofErr w:type="gramStart"/>
+            <w:r>
+              <w:t>trends.R</w:t>
+            </w:r>
+            <w:proofErr w:type="spellEnd"/>
+            <w:proofErr w:type="gramEnd"/>
           </w:p>
         </w:tc>
         <w:tc>
@@ -1605,7 +1729,15 @@
               <w:t>Makes a figure with the climate trends over time for each county.</w:t>
             </w:r>
             <w:r>
-              <w:t xml:space="preserve"> Also makes a map that visualizes the average climate for each location (not saved, and not updated to county grouping).</w:t>
+              <w:t xml:space="preserve"> Also makes a map that visualizes the average climate for each location (not </w:t>
+            </w:r>
+            <w:proofErr w:type="gramStart"/>
+            <w:r>
+              <w:t>saved, and</w:t>
+            </w:r>
+            <w:proofErr w:type="gramEnd"/>
+            <w:r>
+              <w:t xml:space="preserve"> not updated to county grouping).</w:t>
             </w:r>
           </w:p>
         </w:tc>
@@ -1778,7 +1910,15 @@
     </w:p>
     <w:p>
       <w:r>
-        <w:t>Table S2.  exact_location/table_all.png</w:t>
+        <w:t>Table S2.  </w:t>
+      </w:r>
+      <w:proofErr w:type="spellStart"/>
+      <w:r>
+        <w:t>exact_location</w:t>
+      </w:r>
+      <w:proofErr w:type="spellEnd"/>
+      <w:r>
+        <w:t>/table_all.png</w:t>
       </w:r>
     </w:p>
     <w:p>

</xml_diff>

<commit_message>
adds description of 7 day offset analysis
</commit_message>
<xml_diff>
--- a/scripts/Script_Descriptions.docx
+++ b/scripts/Script_Descriptions.docx
@@ -158,13 +158,8 @@
           </w:tcPr>
           <w:p>
             <w:r>
-              <w:t>00_analysis_</w:t>
-            </w:r>
-            <w:proofErr w:type="gramStart"/>
-            <w:r>
-              <w:t>functions.R</w:t>
-            </w:r>
-            <w:proofErr w:type="gramEnd"/>
+              <w:t>00_analysis_functions.R</w:t>
+            </w:r>
           </w:p>
         </w:tc>
         <w:tc>
@@ -173,13 +168,8 @@
           </w:tcPr>
           <w:p>
             <w:r>
-              <w:t>00_analysis_</w:t>
-            </w:r>
-            <w:proofErr w:type="gramStart"/>
-            <w:r>
-              <w:t>functions.R</w:t>
-            </w:r>
-            <w:proofErr w:type="gramEnd"/>
+              <w:t>00_analysis_functions.R</w:t>
+            </w:r>
           </w:p>
         </w:tc>
         <w:tc>
@@ -218,13 +208,8 @@
               <w:t>1</w:t>
             </w:r>
             <w:r>
-              <w:t>_R2_</w:t>
-            </w:r>
-            <w:proofErr w:type="gramStart"/>
-            <w:r>
-              <w:t>analyses.R</w:t>
-            </w:r>
-            <w:proofErr w:type="gramEnd"/>
+              <w:t>_R2_analyses.R</w:t>
+            </w:r>
           </w:p>
         </w:tc>
         <w:tc>
@@ -233,13 +218,8 @@
           </w:tcPr>
           <w:p>
             <w:r>
-              <w:t>R2_</w:t>
-            </w:r>
-            <w:proofErr w:type="gramStart"/>
-            <w:r>
-              <w:t>analyses.R</w:t>
-            </w:r>
-            <w:proofErr w:type="gramEnd"/>
+              <w:t>R2_analyses.R</w:t>
+            </w:r>
           </w:p>
         </w:tc>
         <w:tc>
@@ -266,13 +246,8 @@
               <w:ind w:left="108" w:right="-42" w:hanging="153"/>
             </w:pPr>
             <w:r>
-              <w:t>00_analysis_</w:t>
-            </w:r>
-            <w:proofErr w:type="gramStart"/>
-            <w:r>
-              <w:t>functions.R</w:t>
-            </w:r>
-            <w:proofErr w:type="gramEnd"/>
+              <w:t>00_analysis_functions.R</w:t>
+            </w:r>
           </w:p>
           <w:p>
             <w:pPr>
@@ -440,13 +415,8 @@
               <w:t>2</w:t>
             </w:r>
             <w:r>
-              <w:t>_gaus_opt_flow_</w:t>
-            </w:r>
-            <w:proofErr w:type="gramStart"/>
-            <w:r>
-              <w:t>time.R</w:t>
-            </w:r>
-            <w:proofErr w:type="gramEnd"/>
+              <w:t>_gaus_opt_flow_time.R</w:t>
+            </w:r>
           </w:p>
         </w:tc>
         <w:tc>
@@ -455,13 +425,8 @@
           </w:tcPr>
           <w:p>
             <w:r>
-              <w:t>04_gaus_opt_flow_</w:t>
-            </w:r>
-            <w:proofErr w:type="gramStart"/>
-            <w:r>
-              <w:t>time.R</w:t>
-            </w:r>
-            <w:proofErr w:type="gramEnd"/>
+              <w:t>04_gaus_opt_flow_time.R</w:t>
+            </w:r>
           </w:p>
         </w:tc>
         <w:tc>
@@ -476,7 +441,10 @@
           <w:p/>
           <w:p>
             <w:r>
-              <w:t>Also runs analysis on absolute performance of trials.</w:t>
+              <w:t>Also runs analysis on absolute performance of trials</w:t>
+            </w:r>
+            <w:r>
+              <w:t xml:space="preserve"> and change in yield with 7 day offset.</w:t>
             </w:r>
           </w:p>
         </w:tc>
@@ -494,13 +462,8 @@
               <w:ind w:left="108" w:right="-42" w:hanging="153"/>
             </w:pPr>
             <w:r>
-              <w:t>00_analysis_</w:t>
-            </w:r>
-            <w:proofErr w:type="gramStart"/>
-            <w:r>
-              <w:t>functions.R</w:t>
-            </w:r>
-            <w:proofErr w:type="gramEnd"/>
+              <w:t>00_analysis_functions.R</w:t>
+            </w:r>
           </w:p>
           <w:p>
             <w:pPr>
@@ -586,16 +549,9 @@
               </w:numPr>
               <w:ind w:left="108" w:right="-42" w:hanging="153"/>
             </w:pPr>
-            <w:proofErr w:type="spellStart"/>
-            <w:r>
-              <w:t>gauss_allexact_</w:t>
-            </w:r>
-            <w:proofErr w:type="gramStart"/>
-            <w:r>
-              <w:t>mods.RData</w:t>
-            </w:r>
-            <w:proofErr w:type="spellEnd"/>
-            <w:proofErr w:type="gramEnd"/>
+            <w:r>
+              <w:t>gauss_allexact_mods.RData</w:t>
+            </w:r>
           </w:p>
           <w:p>
             <w:pPr>
@@ -651,16 +607,9 @@
               </w:numPr>
               <w:ind w:left="108" w:right="-42" w:hanging="153"/>
             </w:pPr>
-            <w:proofErr w:type="spellStart"/>
-            <w:r>
-              <w:t>gauss_county_</w:t>
-            </w:r>
-            <w:proofErr w:type="gramStart"/>
-            <w:r>
-              <w:t>mods.RData</w:t>
-            </w:r>
-            <w:proofErr w:type="spellEnd"/>
-            <w:proofErr w:type="gramEnd"/>
+            <w:r>
+              <w:t>gauss_county_mods.RData</w:t>
+            </w:r>
           </w:p>
           <w:p>
             <w:pPr>
@@ -757,6 +706,19 @@
             </w:pPr>
             <w:r>
               <w:t>yield_optimum_relationship.png</w:t>
+            </w:r>
+          </w:p>
+          <w:p>
+            <w:pPr>
+              <w:pStyle w:val="ListParagraph"/>
+              <w:numPr>
+                <w:ilvl w:val="0"/>
+                <w:numId w:val="1"/>
+              </w:numPr>
+              <w:ind w:left="108" w:right="-42" w:hanging="153"/>
+            </w:pPr>
+            <w:r>
+              <w:t>yld_dec_7_days.png</w:t>
             </w:r>
           </w:p>
           <w:p>
@@ -780,13 +742,8 @@
           <w:p>
             <w:r>
               <w:lastRenderedPageBreak/>
-              <w:t>03_clim_yearly_</w:t>
-            </w:r>
-            <w:proofErr w:type="gramStart"/>
-            <w:r>
-              <w:t>stats.R</w:t>
-            </w:r>
-            <w:proofErr w:type="gramEnd"/>
+              <w:t>03_clim_yearly_stats.R</w:t>
+            </w:r>
           </w:p>
         </w:tc>
         <w:tc>
@@ -795,13 +752,8 @@
           </w:tcPr>
           <w:p>
             <w:r>
-              <w:t>06_clim_</w:t>
-            </w:r>
-            <w:proofErr w:type="gramStart"/>
-            <w:r>
-              <w:t>analyses.R</w:t>
-            </w:r>
-            <w:proofErr w:type="gramEnd"/>
+              <w:t>06_clim_analyses.R</w:t>
+            </w:r>
           </w:p>
         </w:tc>
         <w:tc>
@@ -810,15 +762,7 @@
           </w:tcPr>
           <w:p>
             <w:r>
-              <w:t xml:space="preserve">Creates a yearly summary of climate parameters for each location from the </w:t>
-            </w:r>
-            <w:proofErr w:type="spellStart"/>
-            <w:r>
-              <w:t>Daymet</w:t>
-            </w:r>
-            <w:proofErr w:type="spellEnd"/>
-            <w:r>
-              <w:t xml:space="preserve"> data from 1980-2023. </w:t>
+              <w:t xml:space="preserve">Creates a yearly summary of climate parameters for each location from the Daymet data from 1980-2023. </w:t>
             </w:r>
           </w:p>
           <w:p/>
@@ -930,13 +874,8 @@
           </w:tcPr>
           <w:p>
             <w:r>
-              <w:t>04_clim_analyses_</w:t>
-            </w:r>
-            <w:proofErr w:type="gramStart"/>
-            <w:r>
-              <w:t>optimum.R</w:t>
-            </w:r>
-            <w:proofErr w:type="gramEnd"/>
+              <w:t>04_clim_analyses_optimum.R</w:t>
+            </w:r>
           </w:p>
         </w:tc>
         <w:tc>
@@ -945,13 +884,8 @@
           </w:tcPr>
           <w:p>
             <w:r>
-              <w:t>06a_clim_analyses_</w:t>
-            </w:r>
-            <w:proofErr w:type="gramStart"/>
-            <w:r>
-              <w:t>optimum.R</w:t>
-            </w:r>
-            <w:proofErr w:type="gramEnd"/>
+              <w:t>06a_clim_analyses_optimum.R</w:t>
+            </w:r>
           </w:p>
         </w:tc>
         <w:tc>
@@ -1281,13 +1215,9 @@
           </w:tcPr>
           <w:p>
             <w:r>
-              <w:t>05_proportion_</w:t>
-            </w:r>
-            <w:proofErr w:type="gramStart"/>
-            <w:r>
-              <w:t>optimal.R</w:t>
-            </w:r>
-            <w:proofErr w:type="gramEnd"/>
+              <w:lastRenderedPageBreak/>
+              <w:t>05_proportion_optimal.R</w:t>
+            </w:r>
           </w:p>
         </w:tc>
         <w:tc>
@@ -1296,13 +1226,8 @@
           </w:tcPr>
           <w:p>
             <w:r>
-              <w:t>07_proportion_</w:t>
-            </w:r>
-            <w:proofErr w:type="gramStart"/>
-            <w:r>
-              <w:t>optimal.R</w:t>
-            </w:r>
-            <w:proofErr w:type="gramEnd"/>
+              <w:t>07_proportion_optimal.R</w:t>
+            </w:r>
           </w:p>
         </w:tc>
         <w:tc>
@@ -1314,11 +1239,7 @@
               <w:t>M</w:t>
             </w:r>
             <w:r>
-              <w:t xml:space="preserve">ultinomial regressions on whether a trial was ‘suitable’, </w:t>
-            </w:r>
-            <w:r>
-              <w:lastRenderedPageBreak/>
-              <w:t>‘early’, ‘late’, or ‘unclear’. There are multinomial regressions for year, location (county or exact), and for climate. Figures are made for only the climate variables that come out as associated with the categorization.</w:t>
+              <w:t>ultinomial regressions on whether a trial was ‘suitable’, ‘early’, ‘late’, or ‘unclear’. There are multinomial regressions for year, location (county or exact), and for climate. Figures are made for only the climate variables that come out as associated with the categorization.</w:t>
             </w:r>
           </w:p>
         </w:tc>
@@ -1336,7 +1257,6 @@
               <w:ind w:left="108" w:right="-42" w:hanging="153"/>
             </w:pPr>
             <w:r>
-              <w:lastRenderedPageBreak/>
               <w:t>optim_clim_county.csv</w:t>
             </w:r>
           </w:p>
@@ -1394,7 +1314,6 @@
           </w:tcPr>
           <w:p>
             <w:r>
-              <w:lastRenderedPageBreak/>
               <w:t>06_variation_DPP.R</w:t>
             </w:r>
           </w:p>
@@ -1404,11 +1323,9 @@
             <w:tcW w:w="781" w:type="pct"/>
           </w:tcPr>
           <w:p>
-            <w:proofErr w:type="spellStart"/>
             <w:r>
               <w:t>variation_DPP.R</w:t>
             </w:r>
-            <w:proofErr w:type="spellEnd"/>
           </w:p>
         </w:tc>
         <w:tc>
@@ -1504,13 +1421,8 @@
           </w:tcPr>
           <w:p>
             <w:r>
-              <w:t>07_ugly_</w:t>
-            </w:r>
-            <w:proofErr w:type="gramStart"/>
-            <w:r>
-              <w:t>map.R</w:t>
-            </w:r>
-            <w:proofErr w:type="gramEnd"/>
+              <w:t>07_ugly_map.R</w:t>
+            </w:r>
           </w:p>
         </w:tc>
         <w:tc>
@@ -1518,16 +1430,9 @@
             <w:tcW w:w="781" w:type="pct"/>
           </w:tcPr>
           <w:p>
-            <w:proofErr w:type="spellStart"/>
-            <w:r>
-              <w:t>ugly_</w:t>
-            </w:r>
-            <w:proofErr w:type="gramStart"/>
-            <w:r>
-              <w:t>map.R</w:t>
-            </w:r>
-            <w:proofErr w:type="spellEnd"/>
-            <w:proofErr w:type="gramEnd"/>
+            <w:r>
+              <w:t>ugly_map.R</w:t>
+            </w:r>
           </w:p>
         </w:tc>
         <w:tc>
@@ -1612,13 +1517,8 @@
           </w:tcPr>
           <w:p>
             <w:r>
-              <w:t>08_summary_</w:t>
-            </w:r>
-            <w:proofErr w:type="gramStart"/>
-            <w:r>
-              <w:t>stats.R</w:t>
-            </w:r>
-            <w:proofErr w:type="gramEnd"/>
+              <w:t>08_summary_stats.R</w:t>
+            </w:r>
           </w:p>
         </w:tc>
         <w:tc>
@@ -1626,16 +1526,9 @@
             <w:tcW w:w="781" w:type="pct"/>
           </w:tcPr>
           <w:p>
-            <w:proofErr w:type="spellStart"/>
-            <w:r>
-              <w:t>summary_</w:t>
-            </w:r>
-            <w:proofErr w:type="gramStart"/>
-            <w:r>
-              <w:t>stats.R</w:t>
-            </w:r>
-            <w:proofErr w:type="spellEnd"/>
-            <w:proofErr w:type="gramEnd"/>
+            <w:r>
+              <w:t>summary_stats.R</w:t>
+            </w:r>
           </w:p>
         </w:tc>
         <w:tc>
@@ -1694,13 +1587,8 @@
           </w:tcPr>
           <w:p>
             <w:r>
-              <w:t>09_climate_</w:t>
-            </w:r>
-            <w:proofErr w:type="gramStart"/>
-            <w:r>
-              <w:t>trends.R</w:t>
-            </w:r>
-            <w:proofErr w:type="gramEnd"/>
+              <w:t>09_climate_trends.R</w:t>
+            </w:r>
           </w:p>
         </w:tc>
         <w:tc>
@@ -1708,16 +1596,9 @@
             <w:tcW w:w="781" w:type="pct"/>
           </w:tcPr>
           <w:p>
-            <w:proofErr w:type="spellStart"/>
-            <w:r>
-              <w:t>climate_</w:t>
-            </w:r>
-            <w:proofErr w:type="gramStart"/>
-            <w:r>
-              <w:t>trends.R</w:t>
-            </w:r>
-            <w:proofErr w:type="spellEnd"/>
-            <w:proofErr w:type="gramEnd"/>
+            <w:r>
+              <w:t>climate_trends.R</w:t>
+            </w:r>
           </w:p>
         </w:tc>
         <w:tc>
@@ -1729,15 +1610,7 @@
               <w:t>Makes a figure with the climate trends over time for each county.</w:t>
             </w:r>
             <w:r>
-              <w:t xml:space="preserve"> Also makes a map that visualizes the average climate for each location (not </w:t>
-            </w:r>
-            <w:proofErr w:type="gramStart"/>
-            <w:r>
-              <w:t>saved, and</w:t>
-            </w:r>
-            <w:proofErr w:type="gramEnd"/>
-            <w:r>
-              <w:t xml:space="preserve"> not updated to county grouping).</w:t>
+              <w:t xml:space="preserve"> Also makes a map that visualizes the average climate for each location (not saved, and not updated to county grouping).</w:t>
             </w:r>
           </w:p>
         </w:tc>
@@ -1910,15 +1783,7 @@
     </w:p>
     <w:p>
       <w:r>
-        <w:t>Table S2.  </w:t>
-      </w:r>
-      <w:proofErr w:type="spellStart"/>
-      <w:r>
-        <w:t>exact_location</w:t>
-      </w:r>
-      <w:proofErr w:type="spellEnd"/>
-      <w:r>
-        <w:t>/table_all.png</w:t>
+        <w:t>Table S2.  exact_location/table_all.png</w:t>
       </w:r>
     </w:p>
     <w:p>

</xml_diff>

<commit_message>
Updating figures for publication
</commit_message>
<xml_diff>
--- a/scripts/Script_Descriptions.docx
+++ b/scripts/Script_Descriptions.docx
@@ -158,8 +158,13 @@
           </w:tcPr>
           <w:p>
             <w:r>
-              <w:t>00_analysis_functions.R</w:t>
-            </w:r>
+              <w:t>00_analysis_</w:t>
+            </w:r>
+            <w:proofErr w:type="gramStart"/>
+            <w:r>
+              <w:t>functions.R</w:t>
+            </w:r>
+            <w:proofErr w:type="gramEnd"/>
           </w:p>
         </w:tc>
         <w:tc>
@@ -168,8 +173,13 @@
           </w:tcPr>
           <w:p>
             <w:r>
-              <w:t>00_analysis_functions.R</w:t>
-            </w:r>
+              <w:t>00_analysis_</w:t>
+            </w:r>
+            <w:proofErr w:type="gramStart"/>
+            <w:r>
+              <w:t>functions.R</w:t>
+            </w:r>
+            <w:proofErr w:type="gramEnd"/>
           </w:p>
         </w:tc>
         <w:tc>
@@ -208,8 +218,13 @@
               <w:t>1</w:t>
             </w:r>
             <w:r>
-              <w:t>_R2_analyses.R</w:t>
-            </w:r>
+              <w:t>_R2_</w:t>
+            </w:r>
+            <w:proofErr w:type="gramStart"/>
+            <w:r>
+              <w:t>analyses.R</w:t>
+            </w:r>
+            <w:proofErr w:type="gramEnd"/>
           </w:p>
         </w:tc>
         <w:tc>
@@ -218,8 +233,13 @@
           </w:tcPr>
           <w:p>
             <w:r>
-              <w:t>R2_analyses.R</w:t>
-            </w:r>
+              <w:t>R2_</w:t>
+            </w:r>
+            <w:proofErr w:type="gramStart"/>
+            <w:r>
+              <w:t>analyses.R</w:t>
+            </w:r>
+            <w:proofErr w:type="gramEnd"/>
           </w:p>
         </w:tc>
         <w:tc>
@@ -246,8 +266,13 @@
               <w:ind w:left="108" w:right="-42" w:hanging="153"/>
             </w:pPr>
             <w:r>
-              <w:t>00_analysis_functions.R</w:t>
-            </w:r>
+              <w:t>00_analysis_</w:t>
+            </w:r>
+            <w:proofErr w:type="gramStart"/>
+            <w:r>
+              <w:t>functions.R</w:t>
+            </w:r>
+            <w:proofErr w:type="gramEnd"/>
           </w:p>
           <w:p>
             <w:pPr>
@@ -415,8 +440,13 @@
               <w:t>2</w:t>
             </w:r>
             <w:r>
-              <w:t>_gaus_opt_flow_time.R</w:t>
-            </w:r>
+              <w:t>_gaus_opt_flow_</w:t>
+            </w:r>
+            <w:proofErr w:type="gramStart"/>
+            <w:r>
+              <w:t>time.R</w:t>
+            </w:r>
+            <w:proofErr w:type="gramEnd"/>
           </w:p>
         </w:tc>
         <w:tc>
@@ -425,8 +455,13 @@
           </w:tcPr>
           <w:p>
             <w:r>
-              <w:t>04_gaus_opt_flow_time.R</w:t>
-            </w:r>
+              <w:t>04_gaus_opt_flow_</w:t>
+            </w:r>
+            <w:proofErr w:type="gramStart"/>
+            <w:r>
+              <w:t>time.R</w:t>
+            </w:r>
+            <w:proofErr w:type="gramEnd"/>
           </w:p>
         </w:tc>
         <w:tc>
@@ -435,7 +470,23 @@
           </w:tcPr>
           <w:p>
             <w:r>
-              <w:t xml:space="preserve">Functions for fitting Gaussian models to all locations, make diagnostic plots of all site years, and write out files with optimal flowering time, and original data. </w:t>
+              <w:t xml:space="preserve">Functions for fitting Gaussian models to all locations, </w:t>
+            </w:r>
+            <w:proofErr w:type="gramStart"/>
+            <w:r>
+              <w:t>make</w:t>
+            </w:r>
+            <w:proofErr w:type="gramEnd"/>
+            <w:r>
+              <w:t xml:space="preserve"> diagnostic plots of all site years, and </w:t>
+            </w:r>
+            <w:proofErr w:type="gramStart"/>
+            <w:r>
+              <w:t>write</w:t>
+            </w:r>
+            <w:proofErr w:type="gramEnd"/>
+            <w:r>
+              <w:t xml:space="preserve"> out files with optimal flowering time, and original data. </w:t>
             </w:r>
           </w:p>
           <w:p/>
@@ -444,7 +495,15 @@
               <w:t>Also runs analysis on absolute performance of trials</w:t>
             </w:r>
             <w:r>
-              <w:t xml:space="preserve"> and change in yield with 7 day offset.</w:t>
+              <w:t xml:space="preserve"> and change in yield with 7 </w:t>
+            </w:r>
+            <w:proofErr w:type="gramStart"/>
+            <w:r>
+              <w:t>day</w:t>
+            </w:r>
+            <w:proofErr w:type="gramEnd"/>
+            <w:r>
+              <w:t xml:space="preserve"> offset.</w:t>
             </w:r>
           </w:p>
         </w:tc>
@@ -462,8 +521,13 @@
               <w:ind w:left="108" w:right="-42" w:hanging="153"/>
             </w:pPr>
             <w:r>
-              <w:t>00_analysis_functions.R</w:t>
-            </w:r>
+              <w:t>00_analysis_</w:t>
+            </w:r>
+            <w:proofErr w:type="gramStart"/>
+            <w:r>
+              <w:t>functions.R</w:t>
+            </w:r>
+            <w:proofErr w:type="gramEnd"/>
           </w:p>
           <w:p>
             <w:pPr>
@@ -549,9 +613,16 @@
               </w:numPr>
               <w:ind w:left="108" w:right="-42" w:hanging="153"/>
             </w:pPr>
-            <w:r>
-              <w:t>gauss_allexact_mods.RData</w:t>
-            </w:r>
+            <w:proofErr w:type="spellStart"/>
+            <w:r>
+              <w:t>gauss_allexact_</w:t>
+            </w:r>
+            <w:proofErr w:type="gramStart"/>
+            <w:r>
+              <w:t>mods.RData</w:t>
+            </w:r>
+            <w:proofErr w:type="spellEnd"/>
+            <w:proofErr w:type="gramEnd"/>
           </w:p>
           <w:p>
             <w:pPr>
@@ -607,9 +678,16 @@
               </w:numPr>
               <w:ind w:left="108" w:right="-42" w:hanging="153"/>
             </w:pPr>
-            <w:r>
-              <w:t>gauss_county_mods.RData</w:t>
-            </w:r>
+            <w:proofErr w:type="spellStart"/>
+            <w:r>
+              <w:t>gauss_county_</w:t>
+            </w:r>
+            <w:proofErr w:type="gramStart"/>
+            <w:r>
+              <w:t>mods.RData</w:t>
+            </w:r>
+            <w:proofErr w:type="spellEnd"/>
+            <w:proofErr w:type="gramEnd"/>
           </w:p>
           <w:p>
             <w:pPr>
@@ -742,8 +820,13 @@
           <w:p>
             <w:r>
               <w:lastRenderedPageBreak/>
-              <w:t>03_clim_yearly_stats.R</w:t>
-            </w:r>
+              <w:t>03_clim_yearly_</w:t>
+            </w:r>
+            <w:proofErr w:type="gramStart"/>
+            <w:r>
+              <w:t>stats.R</w:t>
+            </w:r>
+            <w:proofErr w:type="gramEnd"/>
           </w:p>
         </w:tc>
         <w:tc>
@@ -752,8 +835,13 @@
           </w:tcPr>
           <w:p>
             <w:r>
-              <w:t>06_clim_analyses.R</w:t>
-            </w:r>
+              <w:t>06_clim_</w:t>
+            </w:r>
+            <w:proofErr w:type="gramStart"/>
+            <w:r>
+              <w:t>analyses.R</w:t>
+            </w:r>
+            <w:proofErr w:type="gramEnd"/>
           </w:p>
         </w:tc>
         <w:tc>
@@ -762,7 +850,15 @@
           </w:tcPr>
           <w:p>
             <w:r>
-              <w:t xml:space="preserve">Creates a yearly summary of climate parameters for each location from the Daymet data from 1980-2023. </w:t>
+              <w:t xml:space="preserve">Creates a yearly summary of climate parameters for each location from the </w:t>
+            </w:r>
+            <w:proofErr w:type="spellStart"/>
+            <w:r>
+              <w:t>Daymet</w:t>
+            </w:r>
+            <w:proofErr w:type="spellEnd"/>
+            <w:r>
+              <w:t xml:space="preserve"> data from 1980-2023. </w:t>
             </w:r>
           </w:p>
           <w:p/>
@@ -874,8 +970,13 @@
           </w:tcPr>
           <w:p>
             <w:r>
-              <w:t>04_clim_analyses_optimum.R</w:t>
-            </w:r>
+              <w:t>04_clim_analyses_</w:t>
+            </w:r>
+            <w:proofErr w:type="gramStart"/>
+            <w:r>
+              <w:t>optimum.R</w:t>
+            </w:r>
+            <w:proofErr w:type="gramEnd"/>
           </w:p>
         </w:tc>
         <w:tc>
@@ -884,8 +985,13 @@
           </w:tcPr>
           <w:p>
             <w:r>
-              <w:t>06a_clim_analyses_optimum.R</w:t>
-            </w:r>
+              <w:t>06a_clim_analyses_</w:t>
+            </w:r>
+            <w:proofErr w:type="gramStart"/>
+            <w:r>
+              <w:t>optimum.R</w:t>
+            </w:r>
+            <w:proofErr w:type="gramEnd"/>
           </w:p>
         </w:tc>
         <w:tc>
@@ -894,7 +1000,23 @@
           </w:tcPr>
           <w:p>
             <w:r>
-              <w:t>Does Bayesian analysis of which climate variables relate to optimal flowering time. Can work on both county and exact locations. Runs models for Day of Year, Days past Planting, with GDD70 and GDD fixed period. Does future projections, makes predictor-residual plots for correlated variables.</w:t>
+              <w:t xml:space="preserve">Does Bayesian analysis of which climate variables relate to optimal flowering time. Can work </w:t>
+            </w:r>
+            <w:proofErr w:type="gramStart"/>
+            <w:r>
+              <w:t>on</w:t>
+            </w:r>
+            <w:proofErr w:type="gramEnd"/>
+            <w:r>
+              <w:t xml:space="preserve"> both county and exact locations. Runs models for Day of Year, Days past Planting, with GDD70 and GDD fixed period. Does future projections, </w:t>
+            </w:r>
+            <w:proofErr w:type="gramStart"/>
+            <w:r>
+              <w:t>makes</w:t>
+            </w:r>
+            <w:proofErr w:type="gramEnd"/>
+            <w:r>
+              <w:t xml:space="preserve"> predictor-residual plots for correlated variables.</w:t>
             </w:r>
           </w:p>
         </w:tc>
@@ -1193,8 +1315,13 @@
             <w:pPr>
               <w:ind w:right="-42"/>
             </w:pPr>
-            <w:r>
-              <w:t xml:space="preserve">Can also run this file for exact location, and </w:t>
+            <w:proofErr w:type="gramStart"/>
+            <w:r>
+              <w:t>Can</w:t>
+            </w:r>
+            <w:proofErr w:type="gramEnd"/>
+            <w:r>
+              <w:t xml:space="preserve"> also run this file for exact location, and </w:t>
             </w:r>
             <w:r>
               <w:t>the figures and tables</w:t>
@@ -1216,8 +1343,13 @@
           <w:p>
             <w:r>
               <w:lastRenderedPageBreak/>
-              <w:t>05_proportion_optimal.R</w:t>
-            </w:r>
+              <w:t>05_proportion_</w:t>
+            </w:r>
+            <w:proofErr w:type="gramStart"/>
+            <w:r>
+              <w:t>optimal.R</w:t>
+            </w:r>
+            <w:proofErr w:type="gramEnd"/>
           </w:p>
         </w:tc>
         <w:tc>
@@ -1226,8 +1358,13 @@
           </w:tcPr>
           <w:p>
             <w:r>
-              <w:t>07_proportion_optimal.R</w:t>
-            </w:r>
+              <w:t>07_proportion_</w:t>
+            </w:r>
+            <w:proofErr w:type="gramStart"/>
+            <w:r>
+              <w:t>optimal.R</w:t>
+            </w:r>
+            <w:proofErr w:type="gramEnd"/>
           </w:p>
         </w:tc>
         <w:tc>
@@ -1239,7 +1376,31 @@
               <w:t>M</w:t>
             </w:r>
             <w:r>
-              <w:t>ultinomial regressions on whether a trial was ‘suitable’, ‘early’, ‘late’, or ‘unclear’. There are multinomial regressions for year, location (county or exact), and for climate. Figures are made for only the climate variables that come out as associated with the categorization.</w:t>
+              <w:t>ultinomial regressions on whether a trial was ‘suitable</w:t>
+            </w:r>
+            <w:proofErr w:type="gramStart"/>
+            <w:r>
+              <w:t>’, ‘</w:t>
+            </w:r>
+            <w:proofErr w:type="gramEnd"/>
+            <w:r>
+              <w:t>early</w:t>
+            </w:r>
+            <w:proofErr w:type="gramStart"/>
+            <w:r>
+              <w:t>’, ‘</w:t>
+            </w:r>
+            <w:proofErr w:type="gramEnd"/>
+            <w:r>
+              <w:t xml:space="preserve">late’, or ‘unclear’. There are multinomial regressions for year, location (county or exact), and for climate. Figures are made for only the climate variables that come </w:t>
+            </w:r>
+            <w:proofErr w:type="gramStart"/>
+            <w:r>
+              <w:t>out as</w:t>
+            </w:r>
+            <w:proofErr w:type="gramEnd"/>
+            <w:r>
+              <w:t xml:space="preserve"> associated with the categorization.</w:t>
             </w:r>
           </w:p>
         </w:tc>
@@ -1301,8 +1462,13 @@
             <w:pPr>
               <w:ind w:right="-42"/>
             </w:pPr>
-            <w:r>
-              <w:t>Can also run for exact location and figures will be saved in a different directory.</w:t>
+            <w:proofErr w:type="gramStart"/>
+            <w:r>
+              <w:t>Can</w:t>
+            </w:r>
+            <w:proofErr w:type="gramEnd"/>
+            <w:r>
+              <w:t xml:space="preserve"> also run for exact location and figures will be saved in a different directory.</w:t>
             </w:r>
           </w:p>
         </w:tc>
@@ -1323,9 +1489,11 @@
             <w:tcW w:w="781" w:type="pct"/>
           </w:tcPr>
           <w:p>
+            <w:proofErr w:type="spellStart"/>
             <w:r>
               <w:t>variation_DPP.R</w:t>
             </w:r>
+            <w:proofErr w:type="spellEnd"/>
           </w:p>
         </w:tc>
         <w:tc>
@@ -1333,8 +1501,13 @@
             <w:tcW w:w="1094" w:type="pct"/>
           </w:tcPr>
           <w:p>
-            <w:r>
-              <w:t>Compares flowering timing of commercial and USDA/GRIN accessions in a histogram.</w:t>
+            <w:proofErr w:type="gramStart"/>
+            <w:r>
+              <w:t>Compares</w:t>
+            </w:r>
+            <w:proofErr w:type="gramEnd"/>
+            <w:r>
+              <w:t xml:space="preserve"> flowering timing of commercial and USDA/GRIN accessions in a histogram.</w:t>
             </w:r>
           </w:p>
         </w:tc>
@@ -1421,8 +1594,13 @@
           </w:tcPr>
           <w:p>
             <w:r>
-              <w:t>07_ugly_map.R</w:t>
-            </w:r>
+              <w:t>07_ugly_</w:t>
+            </w:r>
+            <w:proofErr w:type="gramStart"/>
+            <w:r>
+              <w:t>map.R</w:t>
+            </w:r>
+            <w:proofErr w:type="gramEnd"/>
           </w:p>
         </w:tc>
         <w:tc>
@@ -1430,9 +1608,16 @@
             <w:tcW w:w="781" w:type="pct"/>
           </w:tcPr>
           <w:p>
-            <w:r>
-              <w:t>ugly_map.R</w:t>
-            </w:r>
+            <w:proofErr w:type="spellStart"/>
+            <w:r>
+              <w:t>ugly_</w:t>
+            </w:r>
+            <w:proofErr w:type="gramStart"/>
+            <w:r>
+              <w:t>map.R</w:t>
+            </w:r>
+            <w:proofErr w:type="spellEnd"/>
+            <w:proofErr w:type="gramEnd"/>
           </w:p>
         </w:tc>
         <w:tc>
@@ -1517,8 +1702,13 @@
           </w:tcPr>
           <w:p>
             <w:r>
-              <w:t>08_summary_stats.R</w:t>
-            </w:r>
+              <w:t>08_summary_</w:t>
+            </w:r>
+            <w:proofErr w:type="gramStart"/>
+            <w:r>
+              <w:t>stats.R</w:t>
+            </w:r>
+            <w:proofErr w:type="gramEnd"/>
           </w:p>
         </w:tc>
         <w:tc>
@@ -1526,9 +1716,16 @@
             <w:tcW w:w="781" w:type="pct"/>
           </w:tcPr>
           <w:p>
-            <w:r>
-              <w:t>summary_stats.R</w:t>
-            </w:r>
+            <w:proofErr w:type="spellStart"/>
+            <w:r>
+              <w:t>summary_</w:t>
+            </w:r>
+            <w:proofErr w:type="gramStart"/>
+            <w:r>
+              <w:t>stats.R</w:t>
+            </w:r>
+            <w:proofErr w:type="spellEnd"/>
+            <w:proofErr w:type="gramEnd"/>
           </w:p>
         </w:tc>
         <w:tc>
@@ -1587,8 +1784,13 @@
           </w:tcPr>
           <w:p>
             <w:r>
-              <w:t>09_climate_trends.R</w:t>
-            </w:r>
+              <w:t>09_climate_</w:t>
+            </w:r>
+            <w:proofErr w:type="gramStart"/>
+            <w:r>
+              <w:t>trends.R</w:t>
+            </w:r>
+            <w:proofErr w:type="gramEnd"/>
           </w:p>
         </w:tc>
         <w:tc>
@@ -1596,9 +1798,16 @@
             <w:tcW w:w="781" w:type="pct"/>
           </w:tcPr>
           <w:p>
-            <w:r>
-              <w:t>climate_trends.R</w:t>
-            </w:r>
+            <w:proofErr w:type="spellStart"/>
+            <w:r>
+              <w:t>climate_</w:t>
+            </w:r>
+            <w:proofErr w:type="gramStart"/>
+            <w:r>
+              <w:t>trends.R</w:t>
+            </w:r>
+            <w:proofErr w:type="spellEnd"/>
+            <w:proofErr w:type="gramEnd"/>
           </w:p>
         </w:tc>
         <w:tc>
@@ -1610,7 +1819,15 @@
               <w:t>Makes a figure with the climate trends over time for each county.</w:t>
             </w:r>
             <w:r>
-              <w:t xml:space="preserve"> Also makes a map that visualizes the average climate for each location (not saved, and not updated to county grouping).</w:t>
+              <w:t xml:space="preserve"> Also makes a map that visualizes the average climate for each location (not </w:t>
+            </w:r>
+            <w:proofErr w:type="gramStart"/>
+            <w:r>
+              <w:t>saved, and</w:t>
+            </w:r>
+            <w:proofErr w:type="gramEnd"/>
+            <w:r>
+              <w:t xml:space="preserve"> not updated to county grouping).</w:t>
             </w:r>
           </w:p>
         </w:tc>
@@ -1783,7 +2000,15 @@
     </w:p>
     <w:p>
       <w:r>
-        <w:t>Table S2.  exact_location/table_all.png</w:t>
+        <w:t>Table S2.  </w:t>
+      </w:r>
+      <w:proofErr w:type="spellStart"/>
+      <w:r>
+        <w:t>exact_location</w:t>
+      </w:r>
+      <w:proofErr w:type="spellEnd"/>
+      <w:r>
+        <w:t>/table_all.png</w:t>
       </w:r>
     </w:p>
     <w:p>

</xml_diff>

<commit_message>
Updated figures for publication
</commit_message>
<xml_diff>
--- a/scripts/Script_Descriptions.docx
+++ b/scripts/Script_Descriptions.docx
@@ -158,13 +158,8 @@
           </w:tcPr>
           <w:p>
             <w:r>
-              <w:t>00_analysis_</w:t>
-            </w:r>
-            <w:proofErr w:type="gramStart"/>
-            <w:r>
-              <w:t>functions.R</w:t>
-            </w:r>
-            <w:proofErr w:type="gramEnd"/>
+              <w:t>00_analysis_functions.R</w:t>
+            </w:r>
           </w:p>
         </w:tc>
         <w:tc>
@@ -173,13 +168,8 @@
           </w:tcPr>
           <w:p>
             <w:r>
-              <w:t>00_analysis_</w:t>
-            </w:r>
-            <w:proofErr w:type="gramStart"/>
-            <w:r>
-              <w:t>functions.R</w:t>
-            </w:r>
-            <w:proofErr w:type="gramEnd"/>
+              <w:t>00_analysis_functions.R</w:t>
+            </w:r>
           </w:p>
         </w:tc>
         <w:tc>
@@ -218,13 +208,8 @@
               <w:t>1</w:t>
             </w:r>
             <w:r>
-              <w:t>_R2_</w:t>
-            </w:r>
-            <w:proofErr w:type="gramStart"/>
-            <w:r>
-              <w:t>analyses.R</w:t>
-            </w:r>
-            <w:proofErr w:type="gramEnd"/>
+              <w:t>_R2_analyses.R</w:t>
+            </w:r>
           </w:p>
         </w:tc>
         <w:tc>
@@ -233,13 +218,8 @@
           </w:tcPr>
           <w:p>
             <w:r>
-              <w:t>R2_</w:t>
-            </w:r>
-            <w:proofErr w:type="gramStart"/>
-            <w:r>
-              <w:t>analyses.R</w:t>
-            </w:r>
-            <w:proofErr w:type="gramEnd"/>
+              <w:t>R2_analyses.R</w:t>
+            </w:r>
           </w:p>
         </w:tc>
         <w:tc>
@@ -266,13 +246,8 @@
               <w:ind w:left="108" w:right="-42" w:hanging="153"/>
             </w:pPr>
             <w:r>
-              <w:t>00_analysis_</w:t>
-            </w:r>
-            <w:proofErr w:type="gramStart"/>
-            <w:r>
-              <w:t>functions.R</w:t>
-            </w:r>
-            <w:proofErr w:type="gramEnd"/>
+              <w:t>00_analysis_functions.R</w:t>
+            </w:r>
           </w:p>
           <w:p>
             <w:pPr>
@@ -440,13 +415,8 @@
               <w:t>2</w:t>
             </w:r>
             <w:r>
-              <w:t>_gaus_opt_flow_</w:t>
-            </w:r>
-            <w:proofErr w:type="gramStart"/>
-            <w:r>
-              <w:t>time.R</w:t>
-            </w:r>
-            <w:proofErr w:type="gramEnd"/>
+              <w:t>_gaus_opt_flow_time.R</w:t>
+            </w:r>
           </w:p>
         </w:tc>
         <w:tc>
@@ -455,13 +425,8 @@
           </w:tcPr>
           <w:p>
             <w:r>
-              <w:t>04_gaus_opt_flow_</w:t>
-            </w:r>
-            <w:proofErr w:type="gramStart"/>
-            <w:r>
-              <w:t>time.R</w:t>
-            </w:r>
-            <w:proofErr w:type="gramEnd"/>
+              <w:t>04_gaus_opt_flow_time.R</w:t>
+            </w:r>
           </w:p>
         </w:tc>
         <w:tc>
@@ -470,23 +435,7 @@
           </w:tcPr>
           <w:p>
             <w:r>
-              <w:t xml:space="preserve">Functions for fitting Gaussian models to all locations, </w:t>
-            </w:r>
-            <w:proofErr w:type="gramStart"/>
-            <w:r>
-              <w:t>make</w:t>
-            </w:r>
-            <w:proofErr w:type="gramEnd"/>
-            <w:r>
-              <w:t xml:space="preserve"> diagnostic plots of all site years, and </w:t>
-            </w:r>
-            <w:proofErr w:type="gramStart"/>
-            <w:r>
-              <w:t>write</w:t>
-            </w:r>
-            <w:proofErr w:type="gramEnd"/>
-            <w:r>
-              <w:t xml:space="preserve"> out files with optimal flowering time, and original data. </w:t>
+              <w:t xml:space="preserve">Functions for fitting Gaussian models to all locations, make diagnostic plots of all site years, and write out files with optimal flowering time, and original data. </w:t>
             </w:r>
           </w:p>
           <w:p/>
@@ -495,15 +444,7 @@
               <w:t>Also runs analysis on absolute performance of trials</w:t>
             </w:r>
             <w:r>
-              <w:t xml:space="preserve"> and change in yield with 7 </w:t>
-            </w:r>
-            <w:proofErr w:type="gramStart"/>
-            <w:r>
-              <w:t>day</w:t>
-            </w:r>
-            <w:proofErr w:type="gramEnd"/>
-            <w:r>
-              <w:t xml:space="preserve"> offset.</w:t>
+              <w:t xml:space="preserve"> and change in yield with 7 day offset.</w:t>
             </w:r>
           </w:p>
         </w:tc>
@@ -521,13 +462,8 @@
               <w:ind w:left="108" w:right="-42" w:hanging="153"/>
             </w:pPr>
             <w:r>
-              <w:t>00_analysis_</w:t>
-            </w:r>
-            <w:proofErr w:type="gramStart"/>
-            <w:r>
-              <w:t>functions.R</w:t>
-            </w:r>
-            <w:proofErr w:type="gramEnd"/>
+              <w:t>00_analysis_functions.R</w:t>
+            </w:r>
           </w:p>
           <w:p>
             <w:pPr>
@@ -613,16 +549,9 @@
               </w:numPr>
               <w:ind w:left="108" w:right="-42" w:hanging="153"/>
             </w:pPr>
-            <w:proofErr w:type="spellStart"/>
-            <w:r>
-              <w:t>gauss_allexact_</w:t>
-            </w:r>
-            <w:proofErr w:type="gramStart"/>
-            <w:r>
-              <w:t>mods.RData</w:t>
-            </w:r>
-            <w:proofErr w:type="spellEnd"/>
-            <w:proofErr w:type="gramEnd"/>
+            <w:r>
+              <w:t>gauss_allexact_mods.RData</w:t>
+            </w:r>
           </w:p>
           <w:p>
             <w:pPr>
@@ -678,16 +607,9 @@
               </w:numPr>
               <w:ind w:left="108" w:right="-42" w:hanging="153"/>
             </w:pPr>
-            <w:proofErr w:type="spellStart"/>
-            <w:r>
-              <w:t>gauss_county_</w:t>
-            </w:r>
-            <w:proofErr w:type="gramStart"/>
-            <w:r>
-              <w:t>mods.RData</w:t>
-            </w:r>
-            <w:proofErr w:type="spellEnd"/>
-            <w:proofErr w:type="gramEnd"/>
+            <w:r>
+              <w:t>gauss_county_mods.RData</w:t>
+            </w:r>
           </w:p>
           <w:p>
             <w:pPr>
@@ -820,13 +742,8 @@
           <w:p>
             <w:r>
               <w:lastRenderedPageBreak/>
-              <w:t>03_clim_yearly_</w:t>
-            </w:r>
-            <w:proofErr w:type="gramStart"/>
-            <w:r>
-              <w:t>stats.R</w:t>
-            </w:r>
-            <w:proofErr w:type="gramEnd"/>
+              <w:t>03_clim_yearly_stats.R</w:t>
+            </w:r>
           </w:p>
         </w:tc>
         <w:tc>
@@ -835,13 +752,8 @@
           </w:tcPr>
           <w:p>
             <w:r>
-              <w:t>06_clim_</w:t>
-            </w:r>
-            <w:proofErr w:type="gramStart"/>
-            <w:r>
-              <w:t>analyses.R</w:t>
-            </w:r>
-            <w:proofErr w:type="gramEnd"/>
+              <w:t>06_clim_analyses.R</w:t>
+            </w:r>
           </w:p>
         </w:tc>
         <w:tc>
@@ -850,15 +762,7 @@
           </w:tcPr>
           <w:p>
             <w:r>
-              <w:t xml:space="preserve">Creates a yearly summary of climate parameters for each location from the </w:t>
-            </w:r>
-            <w:proofErr w:type="spellStart"/>
-            <w:r>
-              <w:t>Daymet</w:t>
-            </w:r>
-            <w:proofErr w:type="spellEnd"/>
-            <w:r>
-              <w:t xml:space="preserve"> data from 1980-2023. </w:t>
+              <w:t xml:space="preserve">Creates a yearly summary of climate parameters for each location from the Daymet data from 1980-2023. </w:t>
             </w:r>
           </w:p>
           <w:p/>
@@ -970,13 +874,8 @@
           </w:tcPr>
           <w:p>
             <w:r>
-              <w:t>04_clim_analyses_</w:t>
-            </w:r>
-            <w:proofErr w:type="gramStart"/>
-            <w:r>
-              <w:t>optimum.R</w:t>
-            </w:r>
-            <w:proofErr w:type="gramEnd"/>
+              <w:t>04_clim_analyses_optimum.R</w:t>
+            </w:r>
           </w:p>
         </w:tc>
         <w:tc>
@@ -985,13 +884,8 @@
           </w:tcPr>
           <w:p>
             <w:r>
-              <w:t>06a_clim_analyses_</w:t>
-            </w:r>
-            <w:proofErr w:type="gramStart"/>
-            <w:r>
-              <w:t>optimum.R</w:t>
-            </w:r>
-            <w:proofErr w:type="gramEnd"/>
+              <w:t>06a_clim_analyses_optimum.R</w:t>
+            </w:r>
           </w:p>
         </w:tc>
         <w:tc>
@@ -1000,23 +894,7 @@
           </w:tcPr>
           <w:p>
             <w:r>
-              <w:t xml:space="preserve">Does Bayesian analysis of which climate variables relate to optimal flowering time. Can work </w:t>
-            </w:r>
-            <w:proofErr w:type="gramStart"/>
-            <w:r>
-              <w:t>on</w:t>
-            </w:r>
-            <w:proofErr w:type="gramEnd"/>
-            <w:r>
-              <w:t xml:space="preserve"> both county and exact locations. Runs models for Day of Year, Days past Planting, with GDD70 and GDD fixed period. Does future projections, </w:t>
-            </w:r>
-            <w:proofErr w:type="gramStart"/>
-            <w:r>
-              <w:t>makes</w:t>
-            </w:r>
-            <w:proofErr w:type="gramEnd"/>
-            <w:r>
-              <w:t xml:space="preserve"> predictor-residual plots for correlated variables.</w:t>
+              <w:t>Does Bayesian analysis of which climate variables relate to optimal flowering time. Can work on both county and exact locations. Runs models for Day of Year, Days past Planting, with GDD70 and GDD fixed period. Does future projections, makes predictor-residual plots for correlated variables.</w:t>
             </w:r>
           </w:p>
         </w:tc>
@@ -1315,13 +1193,8 @@
             <w:pPr>
               <w:ind w:right="-42"/>
             </w:pPr>
-            <w:proofErr w:type="gramStart"/>
-            <w:r>
-              <w:t>Can</w:t>
-            </w:r>
-            <w:proofErr w:type="gramEnd"/>
-            <w:r>
-              <w:t xml:space="preserve"> also run this file for exact location, and </w:t>
+            <w:r>
+              <w:t xml:space="preserve">Can also run this file for exact location, and </w:t>
             </w:r>
             <w:r>
               <w:t>the figures and tables</w:t>
@@ -1343,13 +1216,8 @@
           <w:p>
             <w:r>
               <w:lastRenderedPageBreak/>
-              <w:t>05_proportion_</w:t>
-            </w:r>
-            <w:proofErr w:type="gramStart"/>
-            <w:r>
-              <w:t>optimal.R</w:t>
-            </w:r>
-            <w:proofErr w:type="gramEnd"/>
+              <w:t>05_proportion_optimal.R</w:t>
+            </w:r>
           </w:p>
         </w:tc>
         <w:tc>
@@ -1358,13 +1226,8 @@
           </w:tcPr>
           <w:p>
             <w:r>
-              <w:t>07_proportion_</w:t>
-            </w:r>
-            <w:proofErr w:type="gramStart"/>
-            <w:r>
-              <w:t>optimal.R</w:t>
-            </w:r>
-            <w:proofErr w:type="gramEnd"/>
+              <w:t>07_proportion_optimal.R</w:t>
+            </w:r>
           </w:p>
         </w:tc>
         <w:tc>
@@ -1376,31 +1239,10 @@
               <w:t>M</w:t>
             </w:r>
             <w:r>
-              <w:t>ultinomial regressions on whether a trial was ‘suitable</w:t>
-            </w:r>
-            <w:proofErr w:type="gramStart"/>
-            <w:r>
-              <w:t>’, ‘</w:t>
-            </w:r>
-            <w:proofErr w:type="gramEnd"/>
-            <w:r>
-              <w:t>early</w:t>
-            </w:r>
-            <w:proofErr w:type="gramStart"/>
-            <w:r>
-              <w:t>’, ‘</w:t>
-            </w:r>
-            <w:proofErr w:type="gramEnd"/>
-            <w:r>
-              <w:t xml:space="preserve">late’, or ‘unclear’. There are multinomial regressions for year, location (county or exact), and for climate. Figures are made for only the climate variables that come </w:t>
-            </w:r>
-            <w:proofErr w:type="gramStart"/>
-            <w:r>
-              <w:t>out as</w:t>
-            </w:r>
-            <w:proofErr w:type="gramEnd"/>
-            <w:r>
-              <w:t xml:space="preserve"> associated with the categorization.</w:t>
+              <w:t>ultinomial regressions on whether a trial was ‘suitable’, ‘early’, ‘late’, or ‘unclear’. There are multinomial regressions for year, location (county or exact), and for climate. Figures are made for only the climate variables that come out as associated with the categorization.</w:t>
+            </w:r>
+            <w:r>
+              <w:t xml:space="preserve"> Also updated with Bayesian versions</w:t>
             </w:r>
           </w:p>
         </w:tc>
@@ -1462,13 +1304,8 @@
             <w:pPr>
               <w:ind w:right="-42"/>
             </w:pPr>
-            <w:proofErr w:type="gramStart"/>
-            <w:r>
-              <w:t>Can</w:t>
-            </w:r>
-            <w:proofErr w:type="gramEnd"/>
-            <w:r>
-              <w:t xml:space="preserve"> also run for exact location and figures will be saved in a different directory.</w:t>
+            <w:r>
+              <w:t>Can also run for exact location and figures will be saved in a different directory.</w:t>
             </w:r>
           </w:p>
         </w:tc>
@@ -1489,11 +1326,9 @@
             <w:tcW w:w="781" w:type="pct"/>
           </w:tcPr>
           <w:p>
-            <w:proofErr w:type="spellStart"/>
             <w:r>
               <w:t>variation_DPP.R</w:t>
             </w:r>
-            <w:proofErr w:type="spellEnd"/>
           </w:p>
         </w:tc>
         <w:tc>
@@ -1501,13 +1336,8 @@
             <w:tcW w:w="1094" w:type="pct"/>
           </w:tcPr>
           <w:p>
-            <w:proofErr w:type="gramStart"/>
-            <w:r>
-              <w:t>Compares</w:t>
-            </w:r>
-            <w:proofErr w:type="gramEnd"/>
-            <w:r>
-              <w:t xml:space="preserve"> flowering timing of commercial and USDA/GRIN accessions in a histogram.</w:t>
+            <w:r>
+              <w:t>Compares flowering timing of commercial and USDA/GRIN accessions in a histogram.</w:t>
             </w:r>
           </w:p>
         </w:tc>
@@ -1594,13 +1424,8 @@
           </w:tcPr>
           <w:p>
             <w:r>
-              <w:t>07_ugly_</w:t>
-            </w:r>
-            <w:proofErr w:type="gramStart"/>
-            <w:r>
-              <w:t>map.R</w:t>
-            </w:r>
-            <w:proofErr w:type="gramEnd"/>
+              <w:t>07_ugly_map.R</w:t>
+            </w:r>
           </w:p>
         </w:tc>
         <w:tc>
@@ -1608,16 +1433,9 @@
             <w:tcW w:w="781" w:type="pct"/>
           </w:tcPr>
           <w:p>
-            <w:proofErr w:type="spellStart"/>
-            <w:r>
-              <w:t>ugly_</w:t>
-            </w:r>
-            <w:proofErr w:type="gramStart"/>
-            <w:r>
-              <w:t>map.R</w:t>
-            </w:r>
-            <w:proofErr w:type="spellEnd"/>
-            <w:proofErr w:type="gramEnd"/>
+            <w:r>
+              <w:t>ugly_map.R</w:t>
+            </w:r>
           </w:p>
         </w:tc>
         <w:tc>
@@ -1702,13 +1520,8 @@
           </w:tcPr>
           <w:p>
             <w:r>
-              <w:t>08_summary_</w:t>
-            </w:r>
-            <w:proofErr w:type="gramStart"/>
-            <w:r>
-              <w:t>stats.R</w:t>
-            </w:r>
-            <w:proofErr w:type="gramEnd"/>
+              <w:t>08_summary_stats.R</w:t>
+            </w:r>
           </w:p>
         </w:tc>
         <w:tc>
@@ -1716,16 +1529,9 @@
             <w:tcW w:w="781" w:type="pct"/>
           </w:tcPr>
           <w:p>
-            <w:proofErr w:type="spellStart"/>
-            <w:r>
-              <w:t>summary_</w:t>
-            </w:r>
-            <w:proofErr w:type="gramStart"/>
-            <w:r>
-              <w:t>stats.R</w:t>
-            </w:r>
-            <w:proofErr w:type="spellEnd"/>
-            <w:proofErr w:type="gramEnd"/>
+            <w:r>
+              <w:t>summary_stats.R</w:t>
+            </w:r>
           </w:p>
         </w:tc>
         <w:tc>
@@ -1784,13 +1590,8 @@
           </w:tcPr>
           <w:p>
             <w:r>
-              <w:t>09_climate_</w:t>
-            </w:r>
-            <w:proofErr w:type="gramStart"/>
-            <w:r>
-              <w:t>trends.R</w:t>
-            </w:r>
-            <w:proofErr w:type="gramEnd"/>
+              <w:t>09_climate_trends.R</w:t>
+            </w:r>
           </w:p>
         </w:tc>
         <w:tc>
@@ -1798,16 +1599,9 @@
             <w:tcW w:w="781" w:type="pct"/>
           </w:tcPr>
           <w:p>
-            <w:proofErr w:type="spellStart"/>
-            <w:r>
-              <w:t>climate_</w:t>
-            </w:r>
-            <w:proofErr w:type="gramStart"/>
-            <w:r>
-              <w:t>trends.R</w:t>
-            </w:r>
-            <w:proofErr w:type="spellEnd"/>
-            <w:proofErr w:type="gramEnd"/>
+            <w:r>
+              <w:t>climate_trends.R</w:t>
+            </w:r>
           </w:p>
         </w:tc>
         <w:tc>
@@ -1819,15 +1613,7 @@
               <w:t>Makes a figure with the climate trends over time for each county.</w:t>
             </w:r>
             <w:r>
-              <w:t xml:space="preserve"> Also makes a map that visualizes the average climate for each location (not </w:t>
-            </w:r>
-            <w:proofErr w:type="gramStart"/>
-            <w:r>
-              <w:t>saved, and</w:t>
-            </w:r>
-            <w:proofErr w:type="gramEnd"/>
-            <w:r>
-              <w:t xml:space="preserve"> not updated to county grouping).</w:t>
+              <w:t xml:space="preserve"> Also makes a map that visualizes the average climate for each location (not saved, and not updated to county grouping).</w:t>
             </w:r>
           </w:p>
         </w:tc>
@@ -2000,15 +1786,7 @@
     </w:p>
     <w:p>
       <w:r>
-        <w:t>Table S2.  </w:t>
-      </w:r>
-      <w:proofErr w:type="spellStart"/>
-      <w:r>
-        <w:t>exact_location</w:t>
-      </w:r>
-      <w:proofErr w:type="spellEnd"/>
-      <w:r>
-        <w:t>/table_all.png</w:t>
+        <w:t>Table S2.  exact_location/table_all.png</w:t>
       </w:r>
     </w:p>
     <w:p>

</xml_diff>